<commit_message>
Ticket PDF: logotipos del Gobierno del Estado de México y del TESCHI
- Encabezado en tres columnas: logo del Gobierno del Estado de México a
  la izquierda, datos de la institución al centro y logo del TESCHI a
  la derecha, centrados verticalmente.
- Logos en public/img (convertidos a PNG, porque FPDF no lee WebP, y
  recortados). Configurables con logo_izquierdo / logo_derecho en
  app/config/institucion.php; si falta un archivo, el texto aprovecha
  el espacio y el ticket se genera igual.
- Documentación, captura del manual y documento Word actualizados.

Co-Authored-By: Claude Opus 5.5 <noreply@anthropic.com>
Claude-Session: https://claude.ai/code/session_01S7TqdHgfDoDM5kA1QhxEHc
</commit_message>
<xml_diff>
--- a/docs/Documentacion_Sistema_Incidencias_TESCHI.docx
+++ b/docs/Documentacion_Sistema_Incidencias_TESCHI.docx
@@ -387,7 +387,7 @@
       <w:r>
         <w:t xml:space="preserve"> desde </w:t>
       </w:r>
-      <w:hyperlink w:history="1" r:id="rIdprrnf9zlojmx5nrfqrcht">
+      <w:hyperlink w:history="1" r:id="rIdmyin6e8uayjthe9uws9f8">
         <w:r>
           <w:rPr>
             <w:rStyle w:val="Hyperlink"/>
@@ -852,7 +852,7 @@
       <w:r>
         <w:t xml:space="preserve">Abre </w:t>
       </w:r>
-      <w:hyperlink w:history="1" r:id="rIdufbksoa_zn3r2si05b-im">
+      <w:hyperlink w:history="1" r:id="rIdsod4t-7-ung0upwaqukda">
         <w:r>
           <w:rPr>
             <w:rStyle w:val="Hyperlink"/>
@@ -1215,7 +1215,7 @@
       <w:r>
         <w:t xml:space="preserve">Abre </w:t>
       </w:r>
-      <w:hyperlink w:history="1" r:id="rIdftyvyh2mxp32mx3opyfpb">
+      <w:hyperlink w:history="1" r:id="rIdxesc6bxv-swmfxz65cu91">
         <w:r>
           <w:rPr>
             <w:rStyle w:val="Hyperlink"/>
@@ -1491,7 +1491,7 @@
         <w:t xml:space="preserve">app\config\institucion.php</w:t>
       </w:r>
       <w:r>
-        <w:t xml:space="preserve"> (textos del ticket y lista de carreras) y coloca el logo en </w:t>
+        <w:t xml:space="preserve"> (textos del ticket y lista de carreras). Los logotipos del ticket están en </w:t>
       </w:r>
       <w:r>
         <w:rPr>
@@ -1500,7 +1500,19 @@
           <w:sz w:val="19"/>
           <w:szCs w:val="19"/>
         </w:rPr>
-        <w:t xml:space="preserve">public\img\logo.png</w:t>
+        <w:t xml:space="preserve">public\img\logo_edomex.png</w:t>
+      </w:r>
+      <w:r>
+        <w:t xml:space="preserve"> y </w:t>
+      </w:r>
+      <w:r>
+        <w:rPr>
+          <w:rFonts w:ascii="Consolas" w:cs="Consolas" w:eastAsia="Consolas" w:hAnsi="Consolas"/>
+          <w:color w:val="5C152D"/>
+          <w:sz w:val="19"/>
+          <w:szCs w:val="19"/>
+        </w:rPr>
+        <w:t xml:space="preserve">public\img\logo_teschi.png</w:t>
       </w:r>
       <w:r>
         <w:t xml:space="preserve">.</w:t>
@@ -5990,7 +6002,17 @@
         <w:spacing w:after="120"/>
       </w:pPr>
       <w:r>
-        <w:t xml:space="preserve">Para que el ticket lleve el logo, guarda la imagen como </w:t>
+        <w:t xml:space="preserve">El encabezado del ticket lleva el logo del </w:t>
+      </w:r>
+      <w:r>
+        <w:rPr>
+          <w:b/>
+          <w:bCs/>
+        </w:rPr>
+        <w:t xml:space="preserve">Gobierno del Estado de México</w:t>
+      </w:r>
+      <w:r>
+        <w:t xml:space="preserve"> a la izquierda (</w:t>
       </w:r>
       <w:r>
         <w:rPr>
@@ -5999,10 +6021,20 @@
           <w:sz w:val="19"/>
           <w:szCs w:val="19"/>
         </w:rPr>
-        <w:t xml:space="preserve">public/img/logo.png</w:t>
-      </w:r>
-      <w:r>
-        <w:t xml:space="preserve"> (o </w:t>
+        <w:t xml:space="preserve">public/img/logo_edomex.png</w:t>
+      </w:r>
+      <w:r>
+        <w:t xml:space="preserve">) y el del </w:t>
+      </w:r>
+      <w:r>
+        <w:rPr>
+          <w:b/>
+          <w:bCs/>
+        </w:rPr>
+        <w:t xml:space="preserve">TESCHI</w:t>
+      </w:r>
+      <w:r>
+        <w:t xml:space="preserve"> a la derecha (</w:t>
       </w:r>
       <w:r>
         <w:rPr>
@@ -6011,10 +6043,58 @@
           <w:sz w:val="19"/>
           <w:szCs w:val="19"/>
         </w:rPr>
-        <w:t xml:space="preserve">logo.jpg</w:t>
-      </w:r>
-      <w:r>
-        <w:t xml:space="preserve">).</w:t>
+        <w:t xml:space="preserve">public/img/logo_teschi.png</w:t>
+      </w:r>
+      <w:r>
+        <w:t xml:space="preserve">). Para cambiarlos, reemplaza esos archivos (PNG o JPG; FPDF no lee WebP) o ajusta </w:t>
+      </w:r>
+      <w:r>
+        <w:rPr>
+          <w:rFonts w:ascii="Consolas" w:cs="Consolas" w:eastAsia="Consolas" w:hAnsi="Consolas"/>
+          <w:color w:val="5C152D"/>
+          <w:sz w:val="19"/>
+          <w:szCs w:val="19"/>
+        </w:rPr>
+        <w:t xml:space="preserve">logo_izquierdo</w:t>
+      </w:r>
+      <w:r>
+        <w:t xml:space="preserve"> / </w:t>
+      </w:r>
+      <w:r>
+        <w:rPr>
+          <w:rFonts w:ascii="Consolas" w:cs="Consolas" w:eastAsia="Consolas" w:hAnsi="Consolas"/>
+          <w:color w:val="5C152D"/>
+          <w:sz w:val="19"/>
+          <w:szCs w:val="19"/>
+        </w:rPr>
+        <w:t xml:space="preserve">logo_derecho</w:t>
+      </w:r>
+      <w:r>
+        <w:t xml:space="preserve"> en </w:t>
+      </w:r>
+      <w:r>
+        <w:rPr>
+          <w:rFonts w:ascii="Consolas" w:cs="Consolas" w:eastAsia="Consolas" w:hAnsi="Consolas"/>
+          <w:color w:val="5C152D"/>
+          <w:sz w:val="19"/>
+          <w:szCs w:val="19"/>
+        </w:rPr>
+        <w:t xml:space="preserve">app/config/institucion.php</w:t>
+      </w:r>
+      <w:r>
+        <w:t xml:space="preserve"> (una ruta vacía </w:t>
+      </w:r>
+      <w:r>
+        <w:rPr>
+          <w:rFonts w:ascii="Consolas" w:cs="Consolas" w:eastAsia="Consolas" w:hAnsi="Consolas"/>
+          <w:color w:val="5C152D"/>
+          <w:sz w:val="19"/>
+          <w:szCs w:val="19"/>
+        </w:rPr>
+        <w:t xml:space="preserve">""</w:t>
+      </w:r>
+      <w:r>
+        <w:t xml:space="preserve"> quita ese logo).</w:t>
       </w:r>
     </w:p>
     <w:p>
@@ -6065,7 +6145,7 @@
       <w:r>
         <w:t xml:space="preserve"> en </w:t>
       </w:r>
-      <w:hyperlink w:history="1" r:id="rIdoecn57h9tfgwa-k5n2_ow">
+      <w:hyperlink w:history="1" r:id="rIdt_1ellfz6iftatqy507a-">
         <w:r>
           <w:rPr>
             <w:rStyle w:val="Hyperlink"/>
@@ -9585,7 +9665,27 @@
         <w:spacing w:after="60"/>
       </w:pPr>
       <w:r>
-        <w:t xml:space="preserve">Encabezado de la institución, </w:t>
+        <w:t xml:space="preserve">Encabezado con los logotipos del </w:t>
+      </w:r>
+      <w:r>
+        <w:rPr>
+          <w:b/>
+          <w:bCs/>
+        </w:rPr>
+        <w:t xml:space="preserve">Gobierno del Estado de México</w:t>
+      </w:r>
+      <w:r>
+        <w:t xml:space="preserve"> y del </w:t>
+      </w:r>
+      <w:r>
+        <w:rPr>
+          <w:b/>
+          <w:bCs/>
+        </w:rPr>
+        <w:t xml:space="preserve">TESCHI</w:t>
+      </w:r>
+      <w:r>
+        <w:t xml:space="preserve">, datos de la institución, </w:t>
       </w:r>
       <w:r>
         <w:rPr>
@@ -12720,7 +12820,7 @@
         </w:rPr>
         <w:t xml:space="preserve">GitHub dibuja este diagrama automáticamente. En otros visores puedes pegarlo en </w:t>
       </w:r>
-      <w:hyperlink w:history="1" r:id="rIdt1wtq_dl-dv_lvmq5uot5">
+      <w:hyperlink w:history="1" r:id="rIduyjs486apu_895ofs6kvt">
         <w:r>
           <w:rPr>
             <w:rStyle w:val="Hyperlink"/>

</xml_diff>

<commit_message>
Rediseño visual: colores institucionales del TESCHI y foto del edificio en el login
- Paleta verde del logotipo (verde TESCHI, verde limón, azul y rojo) en variables :root.
- Login, recuperar y restablecer: foto del edificio de fondo con capa verde,
  tarjeta blanca con el logotipo y pie institucional.
- Encabezado con degradado y logotipo, menú fijo con pestaña activa resaltada,
  tarjetas con sombra, botones redondeados y tablas con cabecera verde.
- Documentación: sección de apariencia, capturas del login y Word regenerado.

Co-Authored-By: Claude Opus 5.5 <noreply@anthropic.com>
Claude-Session: https://claude.ai/code/session_01S7TqdHgfDoDM5kA1QhxEHc
</commit_message>
<xml_diff>
--- a/docs/Documentacion_Sistema_Incidencias_TESCHI.docx
+++ b/docs/Documentacion_Sistema_Incidencias_TESCHI.docx
@@ -387,7 +387,7 @@
       <w:r>
         <w:t xml:space="preserve"> desde </w:t>
       </w:r>
-      <w:hyperlink w:history="1" r:id="rIdmyin6e8uayjthe9uws9f8">
+      <w:hyperlink w:history="1" r:id="rIdkexmaroappbmmgip968qj">
         <w:r>
           <w:rPr>
             <w:rStyle w:val="Hyperlink"/>
@@ -852,7 +852,7 @@
       <w:r>
         <w:t xml:space="preserve">Abre </w:t>
       </w:r>
-      <w:hyperlink w:history="1" r:id="rIdsod4t-7-ung0upwaqukda">
+      <w:hyperlink w:history="1" r:id="rIdilkgfg9pbpfovlwukvb6d">
         <w:r>
           <w:rPr>
             <w:rStyle w:val="Hyperlink"/>
@@ -1215,7 +1215,7 @@
       <w:r>
         <w:t xml:space="preserve">Abre </w:t>
       </w:r>
-      <w:hyperlink w:history="1" r:id="rIdxesc6bxv-swmfxz65cu91">
+      <w:hyperlink w:history="1" r:id="rIddikpxlk2yy0_gjep8xqel">
         <w:r>
           <w:rPr>
             <w:rStyle w:val="Hyperlink"/>
@@ -3322,7 +3322,7 @@
         <w:t xml:space="preserve">Guía de instalación</w:t>
       </w:r>
       <w:r>
-        <w:t xml:space="preserve"> (sección 4.3), con:</w:t>
+        <w:t xml:space="preserve"> (sección 4.4), con:</w:t>
       </w:r>
     </w:p>
     <w:p>
@@ -6102,7 +6102,102 @@
         <w:pStyle w:val="Heading3"/>
       </w:pPr>
       <w:r>
-        <w:t xml:space="preserve">4.3 Envío de correos (opcional)</w:t>
+        <w:t xml:space="preserve">4.3 Apariencia (colores y foto del login)</w:t>
+      </w:r>
+    </w:p>
+    <w:p>
+      <w:pPr>
+        <w:pStyle w:val="ListParagraph"/>
+        <w:numPr>
+          <w:ilvl w:val="0"/>
+          <w:numId w:val="2"/>
+        </w:numPr>
+        <w:spacing w:after="60"/>
+      </w:pPr>
+      <w:r>
+        <w:t xml:space="preserve">La pantalla de inicio de sesión usa de fondo la foto del edificio (</w:t>
+      </w:r>
+      <w:r>
+        <w:rPr>
+          <w:rFonts w:ascii="Consolas" w:cs="Consolas" w:eastAsia="Consolas" w:hAnsi="Consolas"/>
+          <w:color w:val="5C152D"/>
+          <w:sz w:val="19"/>
+          <w:szCs w:val="19"/>
+        </w:rPr>
+        <w:t xml:space="preserve">public/img/fondo_login.jpg</w:t>
+      </w:r>
+      <w:r>
+        <w:t xml:space="preserve">); para cambiarla, reemplaza ese archivo por otra imagen JPG del mismo nombre.</w:t>
+      </w:r>
+    </w:p>
+    <w:p>
+      <w:pPr>
+        <w:pStyle w:val="ListParagraph"/>
+        <w:numPr>
+          <w:ilvl w:val="0"/>
+          <w:numId w:val="2"/>
+        </w:numPr>
+        <w:spacing w:after="60"/>
+      </w:pPr>
+      <w:r>
+        <w:t xml:space="preserve">Los colores institucionales (verde TESCHI, verde limón, azul y rojo del logotipo) están al inicio de </w:t>
+      </w:r>
+      <w:r>
+        <w:rPr>
+          <w:rFonts w:ascii="Consolas" w:cs="Consolas" w:eastAsia="Consolas" w:hAnsi="Consolas"/>
+          <w:color w:val="5C152D"/>
+          <w:sz w:val="19"/>
+          <w:szCs w:val="19"/>
+        </w:rPr>
+        <w:t xml:space="preserve">public/css/style.css</w:t>
+      </w:r>
+      <w:r>
+        <w:t xml:space="preserve">, en el bloque </w:t>
+      </w:r>
+      <w:r>
+        <w:rPr>
+          <w:rFonts w:ascii="Consolas" w:cs="Consolas" w:eastAsia="Consolas" w:hAnsi="Consolas"/>
+          <w:color w:val="5C152D"/>
+          <w:sz w:val="19"/>
+          <w:szCs w:val="19"/>
+        </w:rPr>
+        <w:t xml:space="preserve">:root</w:t>
+      </w:r>
+      <w:r>
+        <w:t xml:space="preserve">; al cambiar una variable cambia en todo el sistema.</w:t>
+      </w:r>
+    </w:p>
+    <w:p>
+      <w:pPr>
+        <w:pStyle w:val="ListParagraph"/>
+        <w:numPr>
+          <w:ilvl w:val="0"/>
+          <w:numId w:val="2"/>
+        </w:numPr>
+        <w:spacing w:after="60"/>
+      </w:pPr>
+      <w:r>
+        <w:t xml:space="preserve">El logotipo del encabezado y del login es </w:t>
+      </w:r>
+      <w:r>
+        <w:rPr>
+          <w:rFonts w:ascii="Consolas" w:cs="Consolas" w:eastAsia="Consolas" w:hAnsi="Consolas"/>
+          <w:color w:val="5C152D"/>
+          <w:sz w:val="19"/>
+          <w:szCs w:val="19"/>
+        </w:rPr>
+        <w:t xml:space="preserve">public/img/logo_teschi_web.png</w:t>
+      </w:r>
+      <w:r>
+        <w:t xml:space="preserve"> (versión ligera del que usa el ticket).</w:t>
+      </w:r>
+    </w:p>
+    <w:p>
+      <w:pPr>
+        <w:pStyle w:val="Heading3"/>
+      </w:pPr>
+      <w:r>
+        <w:t xml:space="preserve">4.4 Envío de correos (opcional)</w:t>
       </w:r>
     </w:p>
     <w:p>
@@ -6145,7 +6240,7 @@
       <w:r>
         <w:t xml:space="preserve"> en </w:t>
       </w:r>
-      <w:hyperlink w:history="1" r:id="rIdt_1ellfz6iftatqy507a-">
+      <w:hyperlink w:history="1" r:id="rIddkhpzrkm33vbp6js5ljyh">
         <w:r>
           <w:rPr>
             <w:rStyle w:val="Hyperlink"/>
@@ -7210,7 +7305,7 @@
                 <w:sz w:val="18"/>
                 <w:szCs w:val="18"/>
               </w:rPr>
-              <w:t xml:space="preserve">Revisa la sección 4.3; mientras tanto el Administrador puede generar el enlace</w:t>
+              <w:t xml:space="preserve">Revisa la sección 4.4; mientras tanto el Administrador puede generar el enlace</w:t>
             </w:r>
           </w:p>
         </w:tc>
@@ -12820,7 +12915,7 @@
         </w:rPr>
         <w:t xml:space="preserve">GitHub dibuja este diagrama automáticamente. En otros visores puedes pegarlo en </w:t>
       </w:r>
-      <w:hyperlink w:history="1" r:id="rIduyjs486apu_895ofs6kvt">
+      <w:hyperlink w:history="1" r:id="rIdwkqxgq0ixlncpkjreeinx">
         <w:r>
           <w:rPr>
             <w:rStyle w:val="Hyperlink"/>

</xml_diff>